<commit_message>
docs: stage contract md/docx content via low-level index update (porcelain.add fails on CJK paths)
</commit_message>
<xml_diff>
--- a/接口书面约定_20260821.docx
+++ b/接口书面约定_20260821.docx
@@ -386,7 +386,7 @@
                 <w:b w:val="0"/>
                 <w:sz w:val="21"/>
               </w:rPr>
-              <w:t>`T{4 位序号}-{unix 秒}`，如 `T0001-1755718800`</w:t>
+              <w:t>`T{4 位序号}-{unix 秒}`，如 `T0001-1787279400`</w:t>
             </w:r>
           </w:p>
         </w:tc>
@@ -937,9 +937,9 @@
         </w:rPr>
         <w:t>{</w:t>
         <w:br/>
+        <w:t>"service": "ccpc-printsvc",</w:t>
+        <w:br/>
         <w:t>"status": "ok",</w:t>
-        <w:br/>
-        <w:t>"service": "ccpc-printsvc",</w:t>
         <w:br/>
         <w:t>"version": "v0.2.0"</w:t>
         <w:br/>
@@ -1071,7 +1071,7 @@
         </w:rPr>
         <w:t>{</w:t>
         <w:br/>
-        <w:t>"task_id": "T0001-1755718800",</w:t>
+        <w:t>"task_id": "T0001-1787279400",</w:t>
         <w:br/>
         <w:t>"status": "pending",</w:t>
         <w:br/>
@@ -1412,7 +1412,7 @@
           <w:b w:val="0"/>
           <w:sz w:val="24"/>
         </w:rPr>
-        <w:t>请求：`GET http://127.0.0.1:18210/api/v1/tasks/T0001-1755718800`</w:t>
+        <w:t>请求：`GET http://127.0.0.1:18210/api/v1/tasks/T0001-1787279400`</w:t>
       </w:r>
     </w:p>
     <w:p>
@@ -1427,17 +1427,15 @@
         </w:rPr>
         <w:t>{</w:t>
         <w:br/>
-        <w:t>"task_id": "T0001-1755718800",</w:t>
+        <w:t>"task_id": "T0001-1787279400",</w:t>
         <w:br/>
         <w:t>"type": "ticket",</w:t>
         <w:br/>
         <w:t>"status": "completed",</w:t>
         <w:br/>
-        <w:t>"output_path": "C:\\Users\\hj\\CodeBuddy\\20260819144818\\printsvc\\output\\ticket_1755718800000000000.pdf",</w:t>
+        <w:t>"output_path": "E:\\CodeBuddyConfig\\20260819144818\\printsvc\\output\\ticket_1787279400000000000.pdf",</w:t>
         <w:br/>
         <w:t>"created_at": "2026-08-21T10:30:00+08:00",</w:t>
-        <w:br/>
-        <w:t>"message": "",</w:t>
         <w:br/>
         <w:t>"data": {</w:t>
         <w:br/>
@@ -1478,7 +1476,7 @@
         </w:rPr>
         <w:t>{</w:t>
         <w:br/>
-        <w:t>"task_id": "T0001-1755718800",</w:t>
+        <w:t>"task_id": "T0001-1787279400",</w:t>
         <w:br/>
         <w:t>"type": "ticket",</w:t>
         <w:br/>
@@ -1877,7 +1875,7 @@
           <w:i/>
           <w:sz w:val="24"/>
         </w:rPr>
-        <w:t>，不再提供兼容转发（见 5.1 中 AI 沟通记录 1）。</w:t>
+        <w:t>，不再提供兼容转发（决策过程见第 3 天报告"问题、计划与 AI 沟通"）。</w:t>
       </w:r>
     </w:p>
     <w:p>

</xml_diff>

<commit_message>
docs: sync D8 doc drift (contract CORS errata / HARNESS / README / run_checks / DEMO)
</commit_message>
<xml_diff>
--- a/接口书面约定_20260821.docx
+++ b/接口书面约定_20260821.docx
@@ -454,7 +454,7 @@
                 <w:b w:val="0"/>
                 <w:sz w:val="21"/>
               </w:rPr>
-              <w:t>允许本地页面跨域探活：`Access-Control-Allow-Origin: *`</w:t>
+              <w:t>仅允许本地来源跨域探活（D8 安全强化 G7）：`Origin` ∈ `127.0.0.1`/`::1`/`localhost` 时回 `Access-Control-Allow-Origin`，其余来源不设 CORS 头</w:t>
             </w:r>
           </w:p>
         </w:tc>
@@ -2265,6 +2265,56 @@
           </w:p>
         </w:tc>
       </w:tr>
+      <w:tr>
+        <w:tc>
+          <w:tcPr>
+            <w:tcW w:type="dxa" w:w="2880"/>
+          </w:tcPr>
+          <w:p>
+            <w:r/>
+            <w:r>
+              <w:rPr>
+                <w:rFonts w:ascii="宋体" w:hAnsi="宋体" w:eastAsia="宋体"/>
+                <w:b w:val="0"/>
+                <w:sz w:val="21"/>
+              </w:rPr>
+              <w:t>v1.0（勘误）</w:t>
+            </w:r>
+          </w:p>
+        </w:tc>
+        <w:tc>
+          <w:tcPr>
+            <w:tcW w:type="dxa" w:w="2880"/>
+          </w:tcPr>
+          <w:p>
+            <w:r/>
+            <w:r>
+              <w:rPr>
+                <w:rFonts w:ascii="宋体" w:hAnsi="宋体" w:eastAsia="宋体"/>
+                <w:b w:val="0"/>
+                <w:sz w:val="21"/>
+              </w:rPr>
+              <w:t>2026-08-26</w:t>
+            </w:r>
+          </w:p>
+        </w:tc>
+        <w:tc>
+          <w:tcPr>
+            <w:tcW w:type="dxa" w:w="2880"/>
+          </w:tcPr>
+          <w:p>
+            <w:r/>
+            <w:r>
+              <w:rPr>
+                <w:rFonts w:ascii="宋体" w:hAnsi="宋体" w:eastAsia="宋体"/>
+                <w:b w:val="0"/>
+                <w:sz w:val="21"/>
+              </w:rPr>
+              <w:t>安全强化（D8 G7）：CORS `*` 改为本机来源白名单。接口路径/字段/错误码/状态机均不变，不属契约语义变更，定案人：侯俊（立项人）</w:t>
+            </w:r>
+          </w:p>
+        </w:tc>
+      </w:tr>
     </w:tbl>
     <w:p/>
     <w:sectPr>

</xml_diff>